<commit_message>
Update question bank: bank/*.json + skill docs/answers
</commit_message>
<xml_diff>
--- a/answers/答题区.docx
+++ b/answers/答题区.docx
@@ -45,7 +45,7 @@
           <w:b/>
           <w:sz w:val="26"/>
         </w:rPr>
-        <w:t>【1】cs_basics_021 · 计算机基础 · hard</w:t>
+        <w:t>【1】bagu_030 · Unity/C# 八股 · medium</w:t>
       </w:r>
     </w:p>
     <w:p>
@@ -53,7 +53,7 @@
         <w:ind w:left="280"/>
       </w:pPr>
       <w:r>
-        <w:t>vector（C++）和 List&lt;T&gt;（C#）的底层实现是什么？push_back 触发扩容时一定要“另开辟一块内存再拷贝”吗？能不能在原基础上原地扩容？</w:t>
+        <w:t>List&lt;T&gt;（以及 C++ 的 std::vector）底层是怎么实现的？动态扩容的代价是什么？（网易互娱 27 届客户端实习一面真题）</w:t>
       </w:r>
     </w:p>
     <w:p>
@@ -98,7 +98,7 @@
           <w:b/>
           <w:sz w:val="26"/>
         </w:rPr>
-        <w:t>【2】rendering_003 · 渲染/TA · medium</w:t>
+        <w:t>【2】rendering_002 · 渲染/TA · medium</w:t>
       </w:r>
     </w:p>
     <w:p>
@@ -106,7 +106,7 @@
         <w:ind w:left="280"/>
       </w:pPr>
       <w:r>
-        <w:t>Blend SrcAlpha OneMinusSrcAlpha 这行代码是什么意思？写出它的混合公式，并说明游戏里的典型用途。</w:t>
+        <w:t>Vertex Shader 是什么？它接收什么、输出什么？其中的坐标变换是怎么算的？</w:t>
       </w:r>
     </w:p>
     <w:p>

</xml_diff>